<commit_message>
Atualização automática - 18/08/2026 09:04
</commit_message>
<xml_diff>
--- a/pesquisa/Anexo_Relatos_Abertos.docx
+++ b/pesquisa/Anexo_Relatos_Abertos.docx
@@ -183,7 +183,7 @@
           <w:sz w:val="20"/>
           <w:szCs w:val="20"/>
         </w:rPr>
-        <w:t xml:space="preserve">17 pessoas escreveram algo no campo. 6 usaram o espaço para dizer que não tinham nada a relatar, com respostas como "nada", "não tenho" e "fui respeitada em toda situação". Sobraram 11 textos que descrevem alguma situação, e são estes. Se você viu o número 14 em alguma versão anterior, era um erro de contagem meu: eu estava filtrando por tamanho do texto, o que incluía os "nada a declarar" mais longos.</w:t>
+        <w:t xml:space="preserve">19 pessoas escreveram algo no campo. 8 usaram o espaço para dizer que não tinham nada a relatar, com respostas como "nada", "não tenho" e "fui respeitada em toda situação". Sobraram 11 textos que descrevem alguma situação, e são estes. A separação entre os dois grupos é feita por regra escrita, não a olho, então ela se repete igual quando chegarem novas respostas.</w:t>
       </w:r>
     </w:p>
     <w:p>
@@ -1288,7 +1288,7 @@
           <w:sz w:val="21"/>
           <w:szCs w:val="21"/>
         </w:rPr>
-        <w:t xml:space="preserve">sem mudar uma palavra do texto, para saber se os 57,0% de respeito pleno se movem.</w:t>
+        <w:t xml:space="preserve">sem mudar uma palavra do texto, para saber se os 59,1% de respeito pleno se movem.</w:t>
       </w:r>
     </w:p>
     <w:p>
@@ -1348,7 +1348,7 @@
           <w:sz w:val="21"/>
           <w:szCs w:val="21"/>
         </w:rPr>
-        <w:t xml:space="preserve">Essas pessoas escreveram achando que alguém leria. Se a próxima temporada começar sem nenhuma sinalização de que algo mudou, a terceira pesquisa não terá 65% de retorno.</w:t>
+        <w:t xml:space="preserve">Essas pessoas escreveram achando que alguém leria. Se a próxima temporada começar sem nenhuma sinalização de que algo mudou, a terceira pesquisa não terá os 74,4% de retorno desta.</w:t>
       </w:r>
     </w:p>
     <w:p>

</xml_diff>